<commit_message>
Added 5 Coloums and Queries into the table and data is being populated nicely
</commit_message>
<xml_diff>
--- a/IM IT plan_2025.03.11.docx
+++ b/IM IT plan_2025.03.11.docx
@@ -717,6 +717,7 @@
           <w:bCs/>
           <w:sz w:val="22"/>
           <w:szCs w:val="22"/>
+          <w:highlight w:val="yellow"/>
         </w:rPr>
         <w:t>Step 3</w:t>
       </w:r>
@@ -726,6 +727,7 @@
           <w:bCs/>
           <w:sz w:val="22"/>
           <w:szCs w:val="22"/>
+          <w:highlight w:val="yellow"/>
         </w:rPr>
         <w:t xml:space="preserve">. </w:t>
       </w:r>
@@ -735,6 +737,7 @@
           <w:bCs/>
           <w:sz w:val="22"/>
           <w:szCs w:val="22"/>
+          <w:highlight w:val="yellow"/>
         </w:rPr>
         <w:t xml:space="preserve">Write </w:t>
       </w:r>
@@ -744,6 +747,7 @@
           <w:bCs/>
           <w:sz w:val="22"/>
           <w:szCs w:val="22"/>
+          <w:highlight w:val="yellow"/>
         </w:rPr>
         <w:t xml:space="preserve">Code to </w:t>
       </w:r>
@@ -753,6 +757,7 @@
           <w:bCs/>
           <w:sz w:val="22"/>
           <w:szCs w:val="22"/>
+          <w:highlight w:val="yellow"/>
         </w:rPr>
         <w:t>Modify Data</w:t>
       </w:r>
@@ -1364,6 +1369,37 @@
           <w:szCs w:val="22"/>
         </w:rPr>
         <w:t>Automatically Build and Send Reports</w:t>
+      </w:r>
+    </w:p>
+    <w:p>
+      <w:pPr>
+        <w:pStyle w:val="NoSpacing"/>
+        <w:rPr>
+          <w:b/>
+          <w:bCs/>
+          <w:sz w:val="22"/>
+          <w:szCs w:val="22"/>
+        </w:rPr>
+      </w:pPr>
+    </w:p>
+    <w:p>
+      <w:pPr>
+        <w:pStyle w:val="NoSpacing"/>
+        <w:rPr>
+          <w:b/>
+          <w:bCs/>
+          <w:sz w:val="22"/>
+          <w:szCs w:val="22"/>
+        </w:rPr>
+      </w:pPr>
+      <w:r>
+        <w:rPr>
+          <w:b/>
+          <w:bCs/>
+          <w:sz w:val="22"/>
+          <w:szCs w:val="22"/>
+        </w:rPr>
+        <w:t>Point Have table of file names and table Names</w:t>
       </w:r>
     </w:p>
     <w:p>
@@ -2066,6 +2102,118 @@
     </w:lvl>
   </w:abstractNum>
   <w:abstractNum w:abstractNumId="6" w15:restartNumberingAfterBreak="0">
+    <w:nsid w:val="577274C1"/>
+    <w:multiLevelType w:val="hybridMultilevel"/>
+    <w:tmpl w:val="1B10BEF8"/>
+    <w:lvl w:ilvl="0" w:tplc="E416AADA">
+      <w:numFmt w:val="bullet"/>
+      <w:lvlText w:val="-"/>
+      <w:lvlJc w:val="left"/>
+      <w:pPr>
+        <w:ind w:left="720" w:hanging="360"/>
+      </w:pPr>
+      <w:rPr>
+        <w:rFonts w:ascii="Aptos" w:eastAsiaTheme="minorHAnsi" w:hAnsi="Aptos" w:cstheme="minorBidi" w:hint="default"/>
+      </w:rPr>
+    </w:lvl>
+    <w:lvl w:ilvl="1" w:tplc="40090003" w:tentative="1">
+      <w:start w:val="1"/>
+      <w:numFmt w:val="bullet"/>
+      <w:lvlText w:val="o"/>
+      <w:lvlJc w:val="left"/>
+      <w:pPr>
+        <w:ind w:left="1440" w:hanging="360"/>
+      </w:pPr>
+      <w:rPr>
+        <w:rFonts w:ascii="Courier New" w:hAnsi="Courier New" w:cs="Courier New" w:hint="default"/>
+      </w:rPr>
+    </w:lvl>
+    <w:lvl w:ilvl="2" w:tplc="40090005" w:tentative="1">
+      <w:start w:val="1"/>
+      <w:numFmt w:val="bullet"/>
+      <w:lvlText w:val=""/>
+      <w:lvlJc w:val="left"/>
+      <w:pPr>
+        <w:ind w:left="2160" w:hanging="360"/>
+      </w:pPr>
+      <w:rPr>
+        <w:rFonts w:ascii="Wingdings" w:hAnsi="Wingdings" w:hint="default"/>
+      </w:rPr>
+    </w:lvl>
+    <w:lvl w:ilvl="3" w:tplc="40090001" w:tentative="1">
+      <w:start w:val="1"/>
+      <w:numFmt w:val="bullet"/>
+      <w:lvlText w:val=""/>
+      <w:lvlJc w:val="left"/>
+      <w:pPr>
+        <w:ind w:left="2880" w:hanging="360"/>
+      </w:pPr>
+      <w:rPr>
+        <w:rFonts w:ascii="Symbol" w:hAnsi="Symbol" w:hint="default"/>
+      </w:rPr>
+    </w:lvl>
+    <w:lvl w:ilvl="4" w:tplc="40090003" w:tentative="1">
+      <w:start w:val="1"/>
+      <w:numFmt w:val="bullet"/>
+      <w:lvlText w:val="o"/>
+      <w:lvlJc w:val="left"/>
+      <w:pPr>
+        <w:ind w:left="3600" w:hanging="360"/>
+      </w:pPr>
+      <w:rPr>
+        <w:rFonts w:ascii="Courier New" w:hAnsi="Courier New" w:cs="Courier New" w:hint="default"/>
+      </w:rPr>
+    </w:lvl>
+    <w:lvl w:ilvl="5" w:tplc="40090005" w:tentative="1">
+      <w:start w:val="1"/>
+      <w:numFmt w:val="bullet"/>
+      <w:lvlText w:val=""/>
+      <w:lvlJc w:val="left"/>
+      <w:pPr>
+        <w:ind w:left="4320" w:hanging="360"/>
+      </w:pPr>
+      <w:rPr>
+        <w:rFonts w:ascii="Wingdings" w:hAnsi="Wingdings" w:hint="default"/>
+      </w:rPr>
+    </w:lvl>
+    <w:lvl w:ilvl="6" w:tplc="40090001" w:tentative="1">
+      <w:start w:val="1"/>
+      <w:numFmt w:val="bullet"/>
+      <w:lvlText w:val=""/>
+      <w:lvlJc w:val="left"/>
+      <w:pPr>
+        <w:ind w:left="5040" w:hanging="360"/>
+      </w:pPr>
+      <w:rPr>
+        <w:rFonts w:ascii="Symbol" w:hAnsi="Symbol" w:hint="default"/>
+      </w:rPr>
+    </w:lvl>
+    <w:lvl w:ilvl="7" w:tplc="40090003" w:tentative="1">
+      <w:start w:val="1"/>
+      <w:numFmt w:val="bullet"/>
+      <w:lvlText w:val="o"/>
+      <w:lvlJc w:val="left"/>
+      <w:pPr>
+        <w:ind w:left="5760" w:hanging="360"/>
+      </w:pPr>
+      <w:rPr>
+        <w:rFonts w:ascii="Courier New" w:hAnsi="Courier New" w:cs="Courier New" w:hint="default"/>
+      </w:rPr>
+    </w:lvl>
+    <w:lvl w:ilvl="8" w:tplc="40090005" w:tentative="1">
+      <w:start w:val="1"/>
+      <w:numFmt w:val="bullet"/>
+      <w:lvlText w:val=""/>
+      <w:lvlJc w:val="left"/>
+      <w:pPr>
+        <w:ind w:left="6480" w:hanging="360"/>
+      </w:pPr>
+      <w:rPr>
+        <w:rFonts w:ascii="Wingdings" w:hAnsi="Wingdings" w:hint="default"/>
+      </w:rPr>
+    </w:lvl>
+  </w:abstractNum>
+  <w:abstractNum w:abstractNumId="7" w15:restartNumberingAfterBreak="0">
     <w:nsid w:val="59B83994"/>
     <w:multiLevelType w:val="hybridMultilevel"/>
     <w:tmpl w:val="61241AFE"/>
@@ -2191,13 +2339,16 @@
     <w:abstractNumId w:val="3"/>
   </w:num>
   <w:num w:numId="5" w16cid:durableId="1290235436">
-    <w:abstractNumId w:val="6"/>
+    <w:abstractNumId w:val="7"/>
   </w:num>
   <w:num w:numId="6" w16cid:durableId="1090201532">
     <w:abstractNumId w:val="1"/>
   </w:num>
   <w:num w:numId="7" w16cid:durableId="56903138">
     <w:abstractNumId w:val="4"/>
+  </w:num>
+  <w:num w:numId="8" w16cid:durableId="438838480">
+    <w:abstractNumId w:val="6"/>
   </w:num>
 </w:numbering>
 </file>
@@ -3427,26 +3578,6 @@
 </file>
 
 <file path=customXml/item1.xml><?xml version="1.0" encoding="utf-8"?>
-<?mso-contentType ?>
-<FormTemplates xmlns="http://schemas.microsoft.com/sharepoint/v3/contenttype/forms">
-  <Display>DocumentLibraryForm</Display>
-  <Edit>DocumentLibraryForm</Edit>
-  <New>DocumentLibraryForm</New>
-</FormTemplates>
-</file>
-
-<file path=customXml/item2.xml><?xml version="1.0" encoding="utf-8"?>
-<p:properties xmlns:p="http://schemas.microsoft.com/office/2006/metadata/properties" xmlns:xsi="http://www.w3.org/2001/XMLSchema-instance" xmlns:pc="http://schemas.microsoft.com/office/infopath/2007/PartnerControls">
-  <documentManagement>
-    <lcf76f155ced4ddcb4097134ff3c332f xmlns="8498dca0-9ad1-4ecd-a1ee-094c1effa7d6">
-      <Terms xmlns="http://schemas.microsoft.com/office/infopath/2007/PartnerControls"/>
-    </lcf76f155ced4ddcb4097134ff3c332f>
-    <TaxCatchAll xmlns="8603674c-b686-4f8d-b2d9-a365a6946651" xsi:nil="true"/>
-  </documentManagement>
-</p:properties>
-</file>
-
-<file path=customXml/item3.xml><?xml version="1.0" encoding="utf-8"?>
 <ct:contentTypeSchema xmlns:ct="http://schemas.microsoft.com/office/2006/metadata/contentType" xmlns:ma="http://schemas.microsoft.com/office/2006/metadata/properties/metaAttributes" ct:_="" ma:_="" ma:contentTypeName="Document" ma:contentTypeID="0x0101008D3B72789C01A547BA9CAE5624CD74FF" ma:contentTypeVersion="13" ma:contentTypeDescription="Create a new document." ma:contentTypeScope="" ma:versionID="92f9586378cedab79db053d342835bfb">
   <xsd:schema xmlns:xsd="http://www.w3.org/2001/XMLSchema" xmlns:xs="http://www.w3.org/2001/XMLSchema" xmlns:p="http://schemas.microsoft.com/office/2006/metadata/properties" xmlns:ns2="8498dca0-9ad1-4ecd-a1ee-094c1effa7d6" xmlns:ns3="8603674c-b686-4f8d-b2d9-a365a6946651" targetNamespace="http://schemas.microsoft.com/office/2006/metadata/properties" ma:root="true" ma:fieldsID="f6060088953b50c27727fb53dd2de1c0" ns2:_="" ns3:_="">
     <xsd:import namespace="8498dca0-9ad1-4ecd-a1ee-094c1effa7d6"/>
@@ -3669,10 +3800,41 @@
 </ct:contentTypeSchema>
 </file>
 
+<file path=customXml/item2.xml><?xml version="1.0" encoding="utf-8"?>
+<p:properties xmlns:p="http://schemas.microsoft.com/office/2006/metadata/properties" xmlns:xsi="http://www.w3.org/2001/XMLSchema-instance" xmlns:pc="http://schemas.microsoft.com/office/infopath/2007/PartnerControls">
+  <documentManagement>
+    <lcf76f155ced4ddcb4097134ff3c332f xmlns="8498dca0-9ad1-4ecd-a1ee-094c1effa7d6">
+      <Terms xmlns="http://schemas.microsoft.com/office/infopath/2007/PartnerControls"/>
+    </lcf76f155ced4ddcb4097134ff3c332f>
+    <TaxCatchAll xmlns="8603674c-b686-4f8d-b2d9-a365a6946651" xsi:nil="true"/>
+  </documentManagement>
+</p:properties>
+</file>
+
+<file path=customXml/item3.xml><?xml version="1.0" encoding="utf-8"?>
+<?mso-contentType ?>
+<FormTemplates xmlns="http://schemas.microsoft.com/sharepoint/v3/contenttype/forms">
+  <Display>DocumentLibraryForm</Display>
+  <Edit>DocumentLibraryForm</Edit>
+  <New>DocumentLibraryForm</New>
+</FormTemplates>
+</file>
+
 <file path=customXml/itemProps1.xml><?xml version="1.0" encoding="utf-8"?>
-<ds:datastoreItem xmlns:ds="http://schemas.openxmlformats.org/officeDocument/2006/customXml" ds:itemID="{3F839596-540F-4D66-B180-201800E923BE}">
+<ds:datastoreItem xmlns:ds="http://schemas.openxmlformats.org/officeDocument/2006/customXml" ds:itemID="{53A7BF6A-9440-4A1B-B653-A5894FD89A58}">
   <ds:schemaRefs>
-    <ds:schemaRef ds:uri="http://schemas.microsoft.com/sharepoint/v3/contenttype/forms"/>
+    <ds:schemaRef ds:uri="http://schemas.microsoft.com/office/2006/metadata/contentType"/>
+    <ds:schemaRef ds:uri="http://schemas.microsoft.com/office/2006/metadata/properties/metaAttributes"/>
+    <ds:schemaRef ds:uri="http://www.w3.org/2001/XMLSchema"/>
+    <ds:schemaRef ds:uri="http://schemas.microsoft.com/office/2006/metadata/properties"/>
+    <ds:schemaRef ds:uri="8498dca0-9ad1-4ecd-a1ee-094c1effa7d6"/>
+    <ds:schemaRef ds:uri="8603674c-b686-4f8d-b2d9-a365a6946651"/>
+    <ds:schemaRef ds:uri="http://schemas.microsoft.com/office/2006/documentManagement/types"/>
+    <ds:schemaRef ds:uri="http://schemas.microsoft.com/office/infopath/2007/PartnerControls"/>
+    <ds:schemaRef ds:uri="http://schemas.openxmlformats.org/package/2006/metadata/core-properties"/>
+    <ds:schemaRef ds:uri="http://purl.org/dc/elements/1.1/"/>
+    <ds:schemaRef ds:uri="http://purl.org/dc/terms/"/>
+    <ds:schemaRef ds:uri="http://schemas.microsoft.com/internal/obd"/>
   </ds:schemaRefs>
 </ds:datastoreItem>
 </file>
@@ -3689,20 +3851,9 @@
 </file>
 
 <file path=customXml/itemProps3.xml><?xml version="1.0" encoding="utf-8"?>
-<ds:datastoreItem xmlns:ds="http://schemas.openxmlformats.org/officeDocument/2006/customXml" ds:itemID="{53A7BF6A-9440-4A1B-B653-A5894FD89A58}">
+<ds:datastoreItem xmlns:ds="http://schemas.openxmlformats.org/officeDocument/2006/customXml" ds:itemID="{3F839596-540F-4D66-B180-201800E923BE}">
   <ds:schemaRefs>
-    <ds:schemaRef ds:uri="http://schemas.microsoft.com/office/2006/metadata/contentType"/>
-    <ds:schemaRef ds:uri="http://schemas.microsoft.com/office/2006/metadata/properties/metaAttributes"/>
-    <ds:schemaRef ds:uri="http://www.w3.org/2001/XMLSchema"/>
-    <ds:schemaRef ds:uri="http://schemas.microsoft.com/office/2006/metadata/properties"/>
-    <ds:schemaRef ds:uri="8498dca0-9ad1-4ecd-a1ee-094c1effa7d6"/>
-    <ds:schemaRef ds:uri="8603674c-b686-4f8d-b2d9-a365a6946651"/>
-    <ds:schemaRef ds:uri="http://schemas.microsoft.com/office/2006/documentManagement/types"/>
-    <ds:schemaRef ds:uri="http://schemas.microsoft.com/office/infopath/2007/PartnerControls"/>
-    <ds:schemaRef ds:uri="http://schemas.openxmlformats.org/package/2006/metadata/core-properties"/>
-    <ds:schemaRef ds:uri="http://purl.org/dc/elements/1.1/"/>
-    <ds:schemaRef ds:uri="http://purl.org/dc/terms/"/>
-    <ds:schemaRef ds:uri="http://schemas.microsoft.com/internal/obd"/>
+    <ds:schemaRef ds:uri="http://schemas.microsoft.com/sharepoint/v3/contenttype/forms"/>
   </ds:schemaRefs>
 </ds:datastoreItem>
 </file>
</xml_diff>